<commit_message>
fidelity: pin an explicit default Normal style in the corpus styles.xml
docDefaults alone doesn't fully constrain Word — some versions still layer their
built-in Normal (1.08 line + 8pt after) on top, which would make a re-exported
ground truth loose again and defeat the determinism fix. Define an explicit
w:default Normal style with the same tight single / 0-after spacing and Calibri
11pt so Word cannot fall back. office-core's output is unchanged (Normal equals
the pinned docDefaults).

Co-Authored-By: Claude Opus 4.8 <noreply@anthropic.com>
Claude-Session: https://claude.ai/code/session_018Ev8UHbfBoKi79wQC3cm6P
</commit_message>
<xml_diff>
--- a/fidelity-corpus/docx/fonts-substitution/source.docx
+++ b/fidelity-corpus/docx/fonts-substitution/source.docx
@@ -52,5 +52,16 @@
       </w:pPr>
     </w:pPrDefault>
   </w:docDefaults>
+  <w:style w:type="paragraph" w:default="1" w:styleId="Normal">
+    <w:name w:val="Normal"/>
+    <w:pPr>
+      <w:spacing w:after="0" w:line="240" w:lineRule="auto"/>
+    </w:pPr>
+    <w:rPr>
+      <w:rFonts w:ascii="Calibri" w:hAnsi="Calibri" w:cs="Calibri"/>
+      <w:sz w:val="22"/>
+      <w:szCs w:val="22"/>
+    </w:rPr>
+  </w:style>
 </w:styles>
 </file>
</xml_diff>